<commit_message>
feat: Update project KPI report and backlog documentation
</commit_message>
<xml_diff>
--- a/docs/sprints/Sprint Review (SP6).docx
+++ b/docs/sprints/Sprint Review (SP6).docx
@@ -340,7 +340,7 @@
                 <w:color w:val="1f1f1f"/>
                 <w:rtl w:val="0"/>
               </w:rPr>
-              <w:t xml:space="preserve">12/10</w:t>
+              <w:t xml:space="preserve">2/10</w:t>
             </w:r>
           </w:p>
         </w:tc>
@@ -441,7 +441,7 @@
                 <w:color w:val="1f1f1f"/>
                 <w:rtl w:val="0"/>
               </w:rPr>
-              <w:t xml:space="preserve">17/10</w:t>
+              <w:t xml:space="preserve">9/10</w:t>
             </w:r>
           </w:p>
         </w:tc>
@@ -531,7 +531,7 @@
                 <w:color w:val="1f1f1f"/>
                 <w:rtl w:val="0"/>
               </w:rPr>
-              <w:t xml:space="preserve">17/10</w:t>
+              <w:t xml:space="preserve">9/10</w:t>
             </w:r>
             <w:r>
               <w:rPr>

</xml_diff>